<commit_message>
Fix report tables whose cells contain a pipe character
The SHAP ranking table header "mean(|SHAP|)" was parsed as extra column
separators, so the table rendered as plain text in HTML and Word, and its
values were left unformatted. Escape pipes in table cells, split Word table
rows on unescaped pipes only, format the column to 4 decimals, and add a
regression test. Reports regenerated with `main.py --report-only`.

Co-Authored-By: Claude Opus 5.5 <noreply@anthropic.com>
</commit_message>
<xml_diff>
--- a/report/实验报告.docx
+++ b/report/实验报告.docx
@@ -8761,16 +8761,14 @@
         <w:tblLook w:firstColumn="1" w:firstRow="1" w:lastColumn="0" w:lastRow="0" w:noHBand="0" w:noVBand="1" w:val="04A0"/>
       </w:tblPr>
       <w:tblGrid>
-        <w:gridCol w:w="1994"/>
-        <w:gridCol w:w="1994"/>
-        <w:gridCol w:w="1994"/>
-        <w:gridCol w:w="1994"/>
-        <w:gridCol w:w="1994"/>
+        <w:gridCol w:w="3324"/>
+        <w:gridCol w:w="3324"/>
+        <w:gridCol w:w="3324"/>
       </w:tblGrid>
       <w:tr>
         <w:tc>
           <w:tcPr>
-            <w:tcW w:type="dxa" w:w="1994"/>
+            <w:tcW w:type="dxa" w:w="3324"/>
           </w:tcPr>
           <w:p>
             <w:r>
@@ -8788,61 +8786,25 @@
         </w:tc>
         <w:tc>
           <w:tcPr>
-            <w:tcW w:type="dxa" w:w="1994"/>
-          </w:tcPr>
-          <w:p>
-            <w:r>
-              <w:rPr>
-                <w:sz w:val="18"/>
-              </w:rPr>
-            </w:r>
-            <w:r>
-              <w:rPr>
-                <w:sz w:val="18"/>
-              </w:rPr>
-              <w:t>mean(</w:t>
-            </w:r>
-          </w:p>
-        </w:tc>
-        <w:tc>
-          <w:tcPr>
-            <w:tcW w:type="dxa" w:w="1994"/>
-          </w:tcPr>
-          <w:p>
-            <w:r>
-              <w:rPr>
-                <w:sz w:val="18"/>
-              </w:rPr>
-            </w:r>
-            <w:r>
-              <w:rPr>
-                <w:sz w:val="18"/>
-              </w:rPr>
-              <w:t>SHAP</w:t>
-            </w:r>
-          </w:p>
-        </w:tc>
-        <w:tc>
-          <w:tcPr>
-            <w:tcW w:type="dxa" w:w="1994"/>
-          </w:tcPr>
-          <w:p>
-            <w:r>
-              <w:rPr>
-                <w:sz w:val="18"/>
-              </w:rPr>
-            </w:r>
-            <w:r>
-              <w:rPr>
-                <w:sz w:val="18"/>
-              </w:rPr>
-              <w:t>)</w:t>
-            </w:r>
-          </w:p>
-        </w:tc>
-        <w:tc>
-          <w:tcPr>
-            <w:tcW w:type="dxa" w:w="1994"/>
+            <w:tcW w:type="dxa" w:w="3324"/>
+          </w:tcPr>
+          <w:p>
+            <w:r>
+              <w:rPr>
+                <w:sz w:val="18"/>
+              </w:rPr>
+            </w:r>
+            <w:r>
+              <w:rPr>
+                <w:sz w:val="18"/>
+              </w:rPr>
+              <w:t>mean(|SHAP|)</w:t>
+            </w:r>
+          </w:p>
+        </w:tc>
+        <w:tc>
+          <w:tcPr>
+            <w:tcW w:type="dxa" w:w="3324"/>
           </w:tcPr>
           <w:p>
             <w:r>
@@ -8862,7 +8824,7 @@
       <w:tr>
         <w:tc>
           <w:tcPr>
-            <w:tcW w:type="dxa" w:w="1994"/>
+            <w:tcW w:type="dxa" w:w="3324"/>
           </w:tcPr>
           <w:p>
             <w:r>
@@ -8880,25 +8842,25 @@
         </w:tc>
         <w:tc>
           <w:tcPr>
-            <w:tcW w:type="dxa" w:w="1994"/>
-          </w:tcPr>
-          <w:p>
-            <w:r>
-              <w:rPr>
-                <w:sz w:val="18"/>
-              </w:rPr>
-            </w:r>
-            <w:r>
-              <w:rPr>
-                <w:sz w:val="18"/>
-              </w:rPr>
-              <w:t>0.10359078358334227</w:t>
-            </w:r>
-          </w:p>
-        </w:tc>
-        <w:tc>
-          <w:tcPr>
-            <w:tcW w:type="dxa" w:w="1994"/>
+            <w:tcW w:type="dxa" w:w="3324"/>
+          </w:tcPr>
+          <w:p>
+            <w:r>
+              <w:rPr>
+                <w:sz w:val="18"/>
+              </w:rPr>
+            </w:r>
+            <w:r>
+              <w:rPr>
+                <w:sz w:val="18"/>
+              </w:rPr>
+              <w:t>0.1036</w:t>
+            </w:r>
+          </w:p>
+        </w:tc>
+        <w:tc>
+          <w:tcPr>
+            <w:tcW w:type="dxa" w:w="3324"/>
           </w:tcPr>
           <w:p>
             <w:r>
@@ -8911,30 +8873,6 @@
                 <w:sz w:val="18"/>
               </w:rPr>
               <w:t>1</w:t>
-            </w:r>
-          </w:p>
-        </w:tc>
-        <w:tc>
-          <w:tcPr>
-            <w:tcW w:type="dxa" w:w="1994"/>
-          </w:tcPr>
-          <w:p>
-            <w:r>
-              <w:rPr>
-                <w:sz w:val="18"/>
-              </w:rPr>
-            </w:r>
-          </w:p>
-        </w:tc>
-        <w:tc>
-          <w:tcPr>
-            <w:tcW w:type="dxa" w:w="1994"/>
-          </w:tcPr>
-          <w:p>
-            <w:r>
-              <w:rPr>
-                <w:sz w:val="18"/>
-              </w:rPr>
             </w:r>
           </w:p>
         </w:tc>
@@ -8942,7 +8880,7 @@
       <w:tr>
         <w:tc>
           <w:tcPr>
-            <w:tcW w:type="dxa" w:w="1994"/>
+            <w:tcW w:type="dxa" w:w="3324"/>
           </w:tcPr>
           <w:p>
             <w:r>
@@ -8960,25 +8898,25 @@
         </w:tc>
         <w:tc>
           <w:tcPr>
-            <w:tcW w:type="dxa" w:w="1994"/>
-          </w:tcPr>
-          <w:p>
-            <w:r>
-              <w:rPr>
-                <w:sz w:val="18"/>
-              </w:rPr>
-            </w:r>
-            <w:r>
-              <w:rPr>
-                <w:sz w:val="18"/>
-              </w:rPr>
-              <w:t>0.09559818569032741</w:t>
-            </w:r>
-          </w:p>
-        </w:tc>
-        <w:tc>
-          <w:tcPr>
-            <w:tcW w:type="dxa" w:w="1994"/>
+            <w:tcW w:type="dxa" w:w="3324"/>
+          </w:tcPr>
+          <w:p>
+            <w:r>
+              <w:rPr>
+                <w:sz w:val="18"/>
+              </w:rPr>
+            </w:r>
+            <w:r>
+              <w:rPr>
+                <w:sz w:val="18"/>
+              </w:rPr>
+              <w:t>0.0956</w:t>
+            </w:r>
+          </w:p>
+        </w:tc>
+        <w:tc>
+          <w:tcPr>
+            <w:tcW w:type="dxa" w:w="3324"/>
           </w:tcPr>
           <w:p>
             <w:r>
@@ -8991,30 +8929,6 @@
                 <w:sz w:val="18"/>
               </w:rPr>
               <w:t>2</w:t>
-            </w:r>
-          </w:p>
-        </w:tc>
-        <w:tc>
-          <w:tcPr>
-            <w:tcW w:type="dxa" w:w="1994"/>
-          </w:tcPr>
-          <w:p>
-            <w:r>
-              <w:rPr>
-                <w:sz w:val="18"/>
-              </w:rPr>
-            </w:r>
-          </w:p>
-        </w:tc>
-        <w:tc>
-          <w:tcPr>
-            <w:tcW w:type="dxa" w:w="1994"/>
-          </w:tcPr>
-          <w:p>
-            <w:r>
-              <w:rPr>
-                <w:sz w:val="18"/>
-              </w:rPr>
             </w:r>
           </w:p>
         </w:tc>
@@ -9022,7 +8936,7 @@
       <w:tr>
         <w:tc>
           <w:tcPr>
-            <w:tcW w:type="dxa" w:w="1994"/>
+            <w:tcW w:type="dxa" w:w="3324"/>
           </w:tcPr>
           <w:p>
             <w:r>
@@ -9040,25 +8954,25 @@
         </w:tc>
         <w:tc>
           <w:tcPr>
-            <w:tcW w:type="dxa" w:w="1994"/>
-          </w:tcPr>
-          <w:p>
-            <w:r>
-              <w:rPr>
-                <w:sz w:val="18"/>
-              </w:rPr>
-            </w:r>
-            <w:r>
-              <w:rPr>
-                <w:sz w:val="18"/>
-              </w:rPr>
-              <w:t>0.04475548577096555</w:t>
-            </w:r>
-          </w:p>
-        </w:tc>
-        <w:tc>
-          <w:tcPr>
-            <w:tcW w:type="dxa" w:w="1994"/>
+            <w:tcW w:type="dxa" w:w="3324"/>
+          </w:tcPr>
+          <w:p>
+            <w:r>
+              <w:rPr>
+                <w:sz w:val="18"/>
+              </w:rPr>
+            </w:r>
+            <w:r>
+              <w:rPr>
+                <w:sz w:val="18"/>
+              </w:rPr>
+              <w:t>0.0448</w:t>
+            </w:r>
+          </w:p>
+        </w:tc>
+        <w:tc>
+          <w:tcPr>
+            <w:tcW w:type="dxa" w:w="3324"/>
           </w:tcPr>
           <w:p>
             <w:r>
@@ -9071,30 +8985,6 @@
                 <w:sz w:val="18"/>
               </w:rPr>
               <w:t>3</w:t>
-            </w:r>
-          </w:p>
-        </w:tc>
-        <w:tc>
-          <w:tcPr>
-            <w:tcW w:type="dxa" w:w="1994"/>
-          </w:tcPr>
-          <w:p>
-            <w:r>
-              <w:rPr>
-                <w:sz w:val="18"/>
-              </w:rPr>
-            </w:r>
-          </w:p>
-        </w:tc>
-        <w:tc>
-          <w:tcPr>
-            <w:tcW w:type="dxa" w:w="1994"/>
-          </w:tcPr>
-          <w:p>
-            <w:r>
-              <w:rPr>
-                <w:sz w:val="18"/>
-              </w:rPr>
             </w:r>
           </w:p>
         </w:tc>
@@ -9102,7 +8992,7 @@
       <w:tr>
         <w:tc>
           <w:tcPr>
-            <w:tcW w:type="dxa" w:w="1994"/>
+            <w:tcW w:type="dxa" w:w="3324"/>
           </w:tcPr>
           <w:p>
             <w:r>
@@ -9120,25 +9010,25 @@
         </w:tc>
         <w:tc>
           <w:tcPr>
-            <w:tcW w:type="dxa" w:w="1994"/>
-          </w:tcPr>
-          <w:p>
-            <w:r>
-              <w:rPr>
-                <w:sz w:val="18"/>
-              </w:rPr>
-            </w:r>
-            <w:r>
-              <w:rPr>
-                <w:sz w:val="18"/>
-              </w:rPr>
-              <w:t>0.03062599877420821</w:t>
-            </w:r>
-          </w:p>
-        </w:tc>
-        <w:tc>
-          <w:tcPr>
-            <w:tcW w:type="dxa" w:w="1994"/>
+            <w:tcW w:type="dxa" w:w="3324"/>
+          </w:tcPr>
+          <w:p>
+            <w:r>
+              <w:rPr>
+                <w:sz w:val="18"/>
+              </w:rPr>
+            </w:r>
+            <w:r>
+              <w:rPr>
+                <w:sz w:val="18"/>
+              </w:rPr>
+              <w:t>0.0306</w:t>
+            </w:r>
+          </w:p>
+        </w:tc>
+        <w:tc>
+          <w:tcPr>
+            <w:tcW w:type="dxa" w:w="3324"/>
           </w:tcPr>
           <w:p>
             <w:r>
@@ -9151,30 +9041,6 @@
                 <w:sz w:val="18"/>
               </w:rPr>
               <w:t>4</w:t>
-            </w:r>
-          </w:p>
-        </w:tc>
-        <w:tc>
-          <w:tcPr>
-            <w:tcW w:type="dxa" w:w="1994"/>
-          </w:tcPr>
-          <w:p>
-            <w:r>
-              <w:rPr>
-                <w:sz w:val="18"/>
-              </w:rPr>
-            </w:r>
-          </w:p>
-        </w:tc>
-        <w:tc>
-          <w:tcPr>
-            <w:tcW w:type="dxa" w:w="1994"/>
-          </w:tcPr>
-          <w:p>
-            <w:r>
-              <w:rPr>
-                <w:sz w:val="18"/>
-              </w:rPr>
             </w:r>
           </w:p>
         </w:tc>
@@ -9182,7 +9048,7 @@
       <w:tr>
         <w:tc>
           <w:tcPr>
-            <w:tcW w:type="dxa" w:w="1994"/>
+            <w:tcW w:type="dxa" w:w="3324"/>
           </w:tcPr>
           <w:p>
             <w:r>
@@ -9200,25 +9066,25 @@
         </w:tc>
         <w:tc>
           <w:tcPr>
-            <w:tcW w:type="dxa" w:w="1994"/>
-          </w:tcPr>
-          <w:p>
-            <w:r>
-              <w:rPr>
-                <w:sz w:val="18"/>
-              </w:rPr>
-            </w:r>
-            <w:r>
-              <w:rPr>
-                <w:sz w:val="18"/>
-              </w:rPr>
-              <w:t>0.027818790059675774</w:t>
-            </w:r>
-          </w:p>
-        </w:tc>
-        <w:tc>
-          <w:tcPr>
-            <w:tcW w:type="dxa" w:w="1994"/>
+            <w:tcW w:type="dxa" w:w="3324"/>
+          </w:tcPr>
+          <w:p>
+            <w:r>
+              <w:rPr>
+                <w:sz w:val="18"/>
+              </w:rPr>
+            </w:r>
+            <w:r>
+              <w:rPr>
+                <w:sz w:val="18"/>
+              </w:rPr>
+              <w:t>0.0278</w:t>
+            </w:r>
+          </w:p>
+        </w:tc>
+        <w:tc>
+          <w:tcPr>
+            <w:tcW w:type="dxa" w:w="3324"/>
           </w:tcPr>
           <w:p>
             <w:r>
@@ -9231,30 +9097,6 @@
                 <w:sz w:val="18"/>
               </w:rPr>
               <w:t>5</w:t>
-            </w:r>
-          </w:p>
-        </w:tc>
-        <w:tc>
-          <w:tcPr>
-            <w:tcW w:type="dxa" w:w="1994"/>
-          </w:tcPr>
-          <w:p>
-            <w:r>
-              <w:rPr>
-                <w:sz w:val="18"/>
-              </w:rPr>
-            </w:r>
-          </w:p>
-        </w:tc>
-        <w:tc>
-          <w:tcPr>
-            <w:tcW w:type="dxa" w:w="1994"/>
-          </w:tcPr>
-          <w:p>
-            <w:r>
-              <w:rPr>
-                <w:sz w:val="18"/>
-              </w:rPr>
             </w:r>
           </w:p>
         </w:tc>
@@ -9262,7 +9104,7 @@
       <w:tr>
         <w:tc>
           <w:tcPr>
-            <w:tcW w:type="dxa" w:w="1994"/>
+            <w:tcW w:type="dxa" w:w="3324"/>
           </w:tcPr>
           <w:p>
             <w:r>
@@ -9280,25 +9122,25 @@
         </w:tc>
         <w:tc>
           <w:tcPr>
-            <w:tcW w:type="dxa" w:w="1994"/>
-          </w:tcPr>
-          <w:p>
-            <w:r>
-              <w:rPr>
-                <w:sz w:val="18"/>
-              </w:rPr>
-            </w:r>
-            <w:r>
-              <w:rPr>
-                <w:sz w:val="18"/>
-              </w:rPr>
-              <w:t>0.021159416730440878</w:t>
-            </w:r>
-          </w:p>
-        </w:tc>
-        <w:tc>
-          <w:tcPr>
-            <w:tcW w:type="dxa" w:w="1994"/>
+            <w:tcW w:type="dxa" w:w="3324"/>
+          </w:tcPr>
+          <w:p>
+            <w:r>
+              <w:rPr>
+                <w:sz w:val="18"/>
+              </w:rPr>
+            </w:r>
+            <w:r>
+              <w:rPr>
+                <w:sz w:val="18"/>
+              </w:rPr>
+              <w:t>0.0212</w:t>
+            </w:r>
+          </w:p>
+        </w:tc>
+        <w:tc>
+          <w:tcPr>
+            <w:tcW w:type="dxa" w:w="3324"/>
           </w:tcPr>
           <w:p>
             <w:r>
@@ -9311,30 +9153,6 @@
                 <w:sz w:val="18"/>
               </w:rPr>
               <w:t>6</w:t>
-            </w:r>
-          </w:p>
-        </w:tc>
-        <w:tc>
-          <w:tcPr>
-            <w:tcW w:type="dxa" w:w="1994"/>
-          </w:tcPr>
-          <w:p>
-            <w:r>
-              <w:rPr>
-                <w:sz w:val="18"/>
-              </w:rPr>
-            </w:r>
-          </w:p>
-        </w:tc>
-        <w:tc>
-          <w:tcPr>
-            <w:tcW w:type="dxa" w:w="1994"/>
-          </w:tcPr>
-          <w:p>
-            <w:r>
-              <w:rPr>
-                <w:sz w:val="18"/>
-              </w:rPr>
             </w:r>
           </w:p>
         </w:tc>
@@ -9342,7 +9160,7 @@
       <w:tr>
         <w:tc>
           <w:tcPr>
-            <w:tcW w:type="dxa" w:w="1994"/>
+            <w:tcW w:type="dxa" w:w="3324"/>
           </w:tcPr>
           <w:p>
             <w:r>
@@ -9360,25 +9178,25 @@
         </w:tc>
         <w:tc>
           <w:tcPr>
-            <w:tcW w:type="dxa" w:w="1994"/>
-          </w:tcPr>
-          <w:p>
-            <w:r>
-              <w:rPr>
-                <w:sz w:val="18"/>
-              </w:rPr>
-            </w:r>
-            <w:r>
-              <w:rPr>
-                <w:sz w:val="18"/>
-              </w:rPr>
-              <w:t>0.01720575327004047</w:t>
-            </w:r>
-          </w:p>
-        </w:tc>
-        <w:tc>
-          <w:tcPr>
-            <w:tcW w:type="dxa" w:w="1994"/>
+            <w:tcW w:type="dxa" w:w="3324"/>
+          </w:tcPr>
+          <w:p>
+            <w:r>
+              <w:rPr>
+                <w:sz w:val="18"/>
+              </w:rPr>
+            </w:r>
+            <w:r>
+              <w:rPr>
+                <w:sz w:val="18"/>
+              </w:rPr>
+              <w:t>0.0172</w:t>
+            </w:r>
+          </w:p>
+        </w:tc>
+        <w:tc>
+          <w:tcPr>
+            <w:tcW w:type="dxa" w:w="3324"/>
           </w:tcPr>
           <w:p>
             <w:r>
@@ -9391,30 +9209,6 @@
                 <w:sz w:val="18"/>
               </w:rPr>
               <w:t>7</w:t>
-            </w:r>
-          </w:p>
-        </w:tc>
-        <w:tc>
-          <w:tcPr>
-            <w:tcW w:type="dxa" w:w="1994"/>
-          </w:tcPr>
-          <w:p>
-            <w:r>
-              <w:rPr>
-                <w:sz w:val="18"/>
-              </w:rPr>
-            </w:r>
-          </w:p>
-        </w:tc>
-        <w:tc>
-          <w:tcPr>
-            <w:tcW w:type="dxa" w:w="1994"/>
-          </w:tcPr>
-          <w:p>
-            <w:r>
-              <w:rPr>
-                <w:sz w:val="18"/>
-              </w:rPr>
             </w:r>
           </w:p>
         </w:tc>
@@ -9422,7 +9216,7 @@
       <w:tr>
         <w:tc>
           <w:tcPr>
-            <w:tcW w:type="dxa" w:w="1994"/>
+            <w:tcW w:type="dxa" w:w="3324"/>
           </w:tcPr>
           <w:p>
             <w:r>
@@ -9440,25 +9234,25 @@
         </w:tc>
         <w:tc>
           <w:tcPr>
-            <w:tcW w:type="dxa" w:w="1994"/>
-          </w:tcPr>
-          <w:p>
-            <w:r>
-              <w:rPr>
-                <w:sz w:val="18"/>
-              </w:rPr>
-            </w:r>
-            <w:r>
-              <w:rPr>
-                <w:sz w:val="18"/>
-              </w:rPr>
-              <w:t>0.01670556060836223</w:t>
-            </w:r>
-          </w:p>
-        </w:tc>
-        <w:tc>
-          <w:tcPr>
-            <w:tcW w:type="dxa" w:w="1994"/>
+            <w:tcW w:type="dxa" w:w="3324"/>
+          </w:tcPr>
+          <w:p>
+            <w:r>
+              <w:rPr>
+                <w:sz w:val="18"/>
+              </w:rPr>
+            </w:r>
+            <w:r>
+              <w:rPr>
+                <w:sz w:val="18"/>
+              </w:rPr>
+              <w:t>0.0167</w:t>
+            </w:r>
+          </w:p>
+        </w:tc>
+        <w:tc>
+          <w:tcPr>
+            <w:tcW w:type="dxa" w:w="3324"/>
           </w:tcPr>
           <w:p>
             <w:r>
@@ -9471,30 +9265,6 @@
                 <w:sz w:val="18"/>
               </w:rPr>
               <w:t>8</w:t>
-            </w:r>
-          </w:p>
-        </w:tc>
-        <w:tc>
-          <w:tcPr>
-            <w:tcW w:type="dxa" w:w="1994"/>
-          </w:tcPr>
-          <w:p>
-            <w:r>
-              <w:rPr>
-                <w:sz w:val="18"/>
-              </w:rPr>
-            </w:r>
-          </w:p>
-        </w:tc>
-        <w:tc>
-          <w:tcPr>
-            <w:tcW w:type="dxa" w:w="1994"/>
-          </w:tcPr>
-          <w:p>
-            <w:r>
-              <w:rPr>
-                <w:sz w:val="18"/>
-              </w:rPr>
             </w:r>
           </w:p>
         </w:tc>
@@ -9502,7 +9272,7 @@
       <w:tr>
         <w:tc>
           <w:tcPr>
-            <w:tcW w:type="dxa" w:w="1994"/>
+            <w:tcW w:type="dxa" w:w="3324"/>
           </w:tcPr>
           <w:p>
             <w:r>
@@ -9520,25 +9290,25 @@
         </w:tc>
         <w:tc>
           <w:tcPr>
-            <w:tcW w:type="dxa" w:w="1994"/>
-          </w:tcPr>
-          <w:p>
-            <w:r>
-              <w:rPr>
-                <w:sz w:val="18"/>
-              </w:rPr>
-            </w:r>
-            <w:r>
-              <w:rPr>
-                <w:sz w:val="18"/>
-              </w:rPr>
-              <w:t>0.01567856617974038</w:t>
-            </w:r>
-          </w:p>
-        </w:tc>
-        <w:tc>
-          <w:tcPr>
-            <w:tcW w:type="dxa" w:w="1994"/>
+            <w:tcW w:type="dxa" w:w="3324"/>
+          </w:tcPr>
+          <w:p>
+            <w:r>
+              <w:rPr>
+                <w:sz w:val="18"/>
+              </w:rPr>
+            </w:r>
+            <w:r>
+              <w:rPr>
+                <w:sz w:val="18"/>
+              </w:rPr>
+              <w:t>0.0157</w:t>
+            </w:r>
+          </w:p>
+        </w:tc>
+        <w:tc>
+          <w:tcPr>
+            <w:tcW w:type="dxa" w:w="3324"/>
           </w:tcPr>
           <w:p>
             <w:r>
@@ -9551,30 +9321,6 @@
                 <w:sz w:val="18"/>
               </w:rPr>
               <w:t>9</w:t>
-            </w:r>
-          </w:p>
-        </w:tc>
-        <w:tc>
-          <w:tcPr>
-            <w:tcW w:type="dxa" w:w="1994"/>
-          </w:tcPr>
-          <w:p>
-            <w:r>
-              <w:rPr>
-                <w:sz w:val="18"/>
-              </w:rPr>
-            </w:r>
-          </w:p>
-        </w:tc>
-        <w:tc>
-          <w:tcPr>
-            <w:tcW w:type="dxa" w:w="1994"/>
-          </w:tcPr>
-          <w:p>
-            <w:r>
-              <w:rPr>
-                <w:sz w:val="18"/>
-              </w:rPr>
             </w:r>
           </w:p>
         </w:tc>
@@ -9582,7 +9328,7 @@
       <w:tr>
         <w:tc>
           <w:tcPr>
-            <w:tcW w:type="dxa" w:w="1994"/>
+            <w:tcW w:type="dxa" w:w="3324"/>
           </w:tcPr>
           <w:p>
             <w:r>
@@ -9600,25 +9346,25 @@
         </w:tc>
         <w:tc>
           <w:tcPr>
-            <w:tcW w:type="dxa" w:w="1994"/>
-          </w:tcPr>
-          <w:p>
-            <w:r>
-              <w:rPr>
-                <w:sz w:val="18"/>
-              </w:rPr>
-            </w:r>
-            <w:r>
-              <w:rPr>
-                <w:sz w:val="18"/>
-              </w:rPr>
-              <w:t>0.009117741566374795</w:t>
-            </w:r>
-          </w:p>
-        </w:tc>
-        <w:tc>
-          <w:tcPr>
-            <w:tcW w:type="dxa" w:w="1994"/>
+            <w:tcW w:type="dxa" w:w="3324"/>
+          </w:tcPr>
+          <w:p>
+            <w:r>
+              <w:rPr>
+                <w:sz w:val="18"/>
+              </w:rPr>
+            </w:r>
+            <w:r>
+              <w:rPr>
+                <w:sz w:val="18"/>
+              </w:rPr>
+              <w:t>0.0091</w:t>
+            </w:r>
+          </w:p>
+        </w:tc>
+        <w:tc>
+          <w:tcPr>
+            <w:tcW w:type="dxa" w:w="3324"/>
           </w:tcPr>
           <w:p>
             <w:r>
@@ -9631,30 +9377,6 @@
                 <w:sz w:val="18"/>
               </w:rPr>
               <w:t>10</w:t>
-            </w:r>
-          </w:p>
-        </w:tc>
-        <w:tc>
-          <w:tcPr>
-            <w:tcW w:type="dxa" w:w="1994"/>
-          </w:tcPr>
-          <w:p>
-            <w:r>
-              <w:rPr>
-                <w:sz w:val="18"/>
-              </w:rPr>
-            </w:r>
-          </w:p>
-        </w:tc>
-        <w:tc>
-          <w:tcPr>
-            <w:tcW w:type="dxa" w:w="1994"/>
-          </w:tcPr>
-          <w:p>
-            <w:r>
-              <w:rPr>
-                <w:sz w:val="18"/>
-              </w:rPr>
             </w:r>
           </w:p>
         </w:tc>

</xml_diff>